<commit_message>
Add make seed and fix report
</commit_message>
<xml_diff>
--- a/docs/ОПИ_ЛР2_отчёт_вариант_34.docx
+++ b/docs/ОПИ_ЛР2_отчёт_вариант_34.docx
@@ -750,7 +750,7 @@
           <w:sz w:val="28"/>
         </w:rPr>
         <w:tab/>
-        <w:t>11</w:t>
+        <w:t>12</w:t>
       </w:r>
     </w:p>
     <w:p>
@@ -780,7 +780,7 @@
           <w:sz w:val="28"/>
         </w:rPr>
         <w:tab/>
-        <w:t>11</w:t>
+        <w:t>12</w:t>
       </w:r>
     </w:p>
     <w:p>
@@ -810,7 +810,7 @@
           <w:sz w:val="28"/>
         </w:rPr>
         <w:tab/>
-        <w:t>12</w:t>
+        <w:t>13</w:t>
       </w:r>
     </w:p>
     <w:p>
@@ -840,7 +840,7 @@
           <w:sz w:val="28"/>
         </w:rPr>
         <w:tab/>
-        <w:t>13</w:t>
+        <w:t>14</w:t>
       </w:r>
     </w:p>
     <w:p>
@@ -870,7 +870,7 @@
           <w:sz w:val="28"/>
         </w:rPr>
         <w:tab/>
-        <w:t>16</w:t>
+        <w:t>17</w:t>
       </w:r>
     </w:p>
     <w:p>
@@ -900,7 +900,7 @@
           <w:sz w:val="28"/>
         </w:rPr>
         <w:tab/>
-        <w:t>19</w:t>
+        <w:t>20</w:t>
       </w:r>
     </w:p>
     <w:p>
@@ -930,7 +930,7 @@
           <w:sz w:val="28"/>
         </w:rPr>
         <w:tab/>
-        <w:t>22</w:t>
+        <w:t>23</w:t>
       </w:r>
     </w:p>
     <w:p>
@@ -960,7 +960,7 @@
           <w:sz w:val="28"/>
         </w:rPr>
         <w:tab/>
-        <w:t>23</w:t>
+        <w:t>24</w:t>
       </w:r>
     </w:p>
     <w:p>
@@ -990,7 +990,7 @@
           <w:sz w:val="28"/>
         </w:rPr>
         <w:tab/>
-        <w:t>23</w:t>
+        <w:t>24</w:t>
       </w:r>
     </w:p>
     <w:p>
@@ -1020,7 +1020,7 @@
           <w:sz w:val="28"/>
         </w:rPr>
         <w:tab/>
-        <w:t>24</w:t>
+        <w:t>25</w:t>
       </w:r>
     </w:p>
     <w:p>
@@ -1050,7 +1050,7 @@
           <w:sz w:val="28"/>
         </w:rPr>
         <w:tab/>
-        <w:t>25</w:t>
+        <w:t>26</w:t>
       </w:r>
     </w:p>
     <w:p>
@@ -1080,7 +1080,7 @@
           <w:sz w:val="28"/>
         </w:rPr>
         <w:tab/>
-        <w:t>27</w:t>
+        <w:t>28</w:t>
       </w:r>
     </w:p>
     <w:p>
@@ -1110,7 +1110,7 @@
           <w:sz w:val="28"/>
         </w:rPr>
         <w:tab/>
-        <w:t>28</w:t>
+        <w:t>29</w:t>
       </w:r>
     </w:p>
     <w:p>
@@ -1359,7 +1359,7 @@
           <w:i w:val="0"/>
           <w:sz w:val="28"/>
         </w:rPr>
-        <w:t>В ходе этапа I решались следующие задачи: развертывание изолированной виртуальной среды; установка и конфигурирование Redmine; создание проекта, учётных записей, ролей, трекеров, статусов и переходов; построение дерева целей и задач по требованиям первой лабораторной работы; настройка Git и модели Git Flow; проверка прав доступа и сохранности данных; оформление отчёта и доклада.</w:t>
+        <w:t>В ходе этапа I командой решались следующие задачи: развертывание изолированной виртуальной среды; установка и конфигурирование Redmine; создание проекта, учётных записей, ролей, трекеров, статусов и переходов; построение дерева целей и задач по требованиям первой лабораторной работы; настройка Git и модели Git Flow; проверка прав доступа и сохранности данных; оформление отчёта и доклада.</w:t>
       </w:r>
     </w:p>
     <w:p>
@@ -1555,7 +1555,7 @@
                 <w:i w:val="0"/>
                 <w:sz w:val="19"/>
               </w:rPr>
-              <w:t>ВМ, Redmine, проект, пользователи, роли, трекеры, статусы, дерево задач, Git, отчёт</w:t>
+              <w:t>Постановка задач, проект, пользователи, роли, трекеры, статусы, переходы, дерево задач, приёмка, отчёт и доклад; работа с готовой средой Redmine</w:t>
             </w:r>
           </w:p>
         </w:tc>
@@ -1629,7 +1629,7 @@
                 <w:i w:val="0"/>
                 <w:sz w:val="19"/>
               </w:rPr>
-              <w:t>Детальная установка Redmine, тема Bleuclair, Git, исходные файлы и README</w:t>
+              <w:t>Установка и настройка ВМ, детальная установка Redmine, тема Bleuclair, исходные файлы и README</w:t>
             </w:r>
           </w:p>
         </w:tc>
@@ -1714,6 +1714,23 @@
         <w:spacing w:line="240" w:lineRule="auto" w:after="0" w:before="0"/>
         <w:ind w:firstLine="0"/>
       </w:pPr>
+    </w:p>
+    <w:p>
+      <w:pPr>
+        <w:keepNext w:val="0"/>
+        <w:spacing w:line="360" w:lineRule="auto" w:before="0" w:after="0"/>
+        <w:ind w:firstLine="709" w:left="0"/>
+        <w:jc w:val="both"/>
+      </w:pPr>
+      <w:r>
+        <w:rPr>
+          <w:rFonts w:ascii="Times New Roman" w:hAnsi="Times New Roman" w:cs="Times New Roman" w:eastAsia="Times New Roman"/>
+          <w:b w:val="0"/>
+          <w:i w:val="0"/>
+          <w:sz w:val="28"/>
+        </w:rPr>
+        <w:t>Фактическое распределение работ было таким: руководитель использовал уже развернутую среду, вел проект в Redmine и отвечал за постановку задач, пользователей, роли, трекеры, статусы, переходы, дерево работ, приемку и отчет; установку и настройку виртуальной машины и Redmine выполнял специалист по ИС; работы с Git, репозиторием и моделью Git Flow — DevOps-инженер. Технические результаты принимались руководителем по критериям, приведенным в разделах 2 и 3.</w:t>
+      </w:r>
     </w:p>
     <w:p>
       <w:pPr>
@@ -3841,7 +3858,7 @@
           <w:i w:val="0"/>
           <w:sz w:val="28"/>
         </w:rPr>
-        <w:t>Задача этапа I — создать воспроизводимую среду разработки и организовать процесс: развернуть виртуальную машину, установить Redmine и Git, создать проект, участников, роли, трекеры, статусы и переходы, построить дерево целей и задач, продемонстрировать модель Git Flow. Результат этапа фиксируется в отчёте снимками экрана и командами.</w:t>
+        <w:t>Задача этапа I состояла в том, чтобы создать воспроизводимую среду разработки и организовать процесс: развернуть виртуальную машину, установить Redmine и Git, создать проект, участников, роли, трекеры, статусы и переходы, построить дерево целей и задач, продемонстрировать модель Git Flow. Результат этапа фиксируется в отчёте снимками экрана и командами.</w:t>
       </w:r>
     </w:p>
     <w:p>
@@ -3858,7 +3875,7 @@
           <w:i w:val="0"/>
           <w:sz w:val="28"/>
         </w:rPr>
-        <w:t>Для достижения цели необходимо было выполнить следующие работы:</w:t>
+        <w:t>Для достижения цели команде необходимо было выполнить следующие работы:</w:t>
       </w:r>
     </w:p>
     <w:p>
@@ -9675,6 +9692,23 @@
         <w:spacing w:line="240" w:lineRule="auto" w:after="0" w:before="0"/>
         <w:ind w:firstLine="0"/>
       </w:pPr>
+    </w:p>
+    <w:p>
+      <w:pPr>
+        <w:keepNext w:val="0"/>
+        <w:spacing w:line="360" w:lineRule="auto" w:before="0" w:after="0"/>
+        <w:ind w:firstLine="709" w:left="0"/>
+        <w:jc w:val="both"/>
+      </w:pPr>
+      <w:r>
+        <w:rPr>
+          <w:rFonts w:ascii="Times New Roman" w:hAnsi="Times New Roman" w:cs="Times New Roman" w:eastAsia="Times New Roman"/>
+          <w:b w:val="0"/>
+          <w:i w:val="0"/>
+          <w:sz w:val="28"/>
+        </w:rPr>
+        <w:t>Задачи 2 и 7 закреплены в Redmine за руководителем как организационные: проверка среды, фиксация версий и приемка репозитория. Непосредственно установку виртуальной машины и Redmine выполнял Д.О. Кочнев, операции с Git — И.М. Королёв.</w:t>
+      </w:r>
     </w:p>
     <w:p>
       <w:pPr>

</xml_diff>